<commit_message>
chore: complete todays english class
</commit_message>
<xml_diff>
--- a/51MN Metologija naukovyh doslidjen/1/MN_KNT-122_Onyshchenko_15_PR1.docx
+++ b/51MN Metologija naukovyh doslidjen/1/MN_KNT-122_Onyshchenko_15_PR1.docx
@@ -394,6 +394,501 @@
       </w:pPr>
       <w:r>
         <w:rPr/>
+      </w:r>
+    </w:p>
+    <w:p>
+      <w:pPr>
+        <w:pStyle w:val="h11"/>
+        <w:rPr/>
+      </w:pPr>
+      <w:r>
+        <w:rPr/>
+        <w:t>Завдання</w:t>
+      </w:r>
+    </w:p>
+    <w:p>
+      <w:pPr>
+        <w:pStyle w:val="p11"/>
+        <w:rPr/>
+      </w:pPr>
+      <w:r>
+        <w:rPr/>
+      </w:r>
+    </w:p>
+    <w:p>
+      <w:pPr>
+        <w:pStyle w:val="p11"/>
+        <w:rPr/>
+      </w:pPr>
+      <w:r>
+        <w:rPr>
+          <w:b/>
+          <w:bCs/>
+        </w:rPr>
+        <w:t>Мета</w:t>
+      </w:r>
+      <w:r>
+        <w:rPr/>
+        <w:t>. Навчитися формулювати проблему, питання й узгоджений методологічний апарат власної роботи.</w:t>
+      </w:r>
+    </w:p>
+    <w:p>
+      <w:pPr>
+        <w:pStyle w:val="p11"/>
+        <w:rPr/>
+      </w:pPr>
+      <w:r>
+        <w:rPr/>
+      </w:r>
+    </w:p>
+    <w:p>
+      <w:pPr>
+        <w:pStyle w:val="H2"/>
+        <w:rPr/>
+      </w:pPr>
+      <w:r>
+        <w:rPr/>
+        <w:t>Очікуваний результат</w:t>
+      </w:r>
+    </w:p>
+    <w:p>
+      <w:pPr>
+        <w:pStyle w:val="p11"/>
+        <w:rPr/>
+      </w:pPr>
+      <w:r>
+        <w:rPr/>
+      </w:r>
+    </w:p>
+    <w:p>
+      <w:pPr>
+        <w:pStyle w:val="p11"/>
+        <w:rPr/>
+      </w:pPr>
+      <w:r>
+        <w:rPr/>
+        <w:t>Паспорт дослідження на 3–4 сторінки: тема, проблема, актуальність, питання, мета, об’єкт, предмет, завдання, гіпотеза або критерії перевірки, межі й ризики.</w:t>
+      </w:r>
+    </w:p>
+    <w:p>
+      <w:pPr>
+        <w:pStyle w:val="p11"/>
+        <w:rPr/>
+      </w:pPr>
+      <w:r>
+        <w:rPr/>
+      </w:r>
+    </w:p>
+    <w:p>
+      <w:pPr>
+        <w:pStyle w:val="H2"/>
+        <w:rPr/>
+      </w:pPr>
+      <w:r>
+        <w:rPr/>
+        <w:t>Теоретичні відомості</w:t>
+      </w:r>
+    </w:p>
+    <w:p>
+      <w:pPr>
+        <w:pStyle w:val="p11"/>
+        <w:rPr/>
+      </w:pPr>
+      <w:r>
+        <w:rPr/>
+      </w:r>
+    </w:p>
+    <w:p>
+      <w:pPr>
+        <w:pStyle w:val="p11"/>
+        <w:rPr/>
+      </w:pPr>
+      <w:r>
+        <w:rPr/>
+        <w:t>Тема окреслює сферу, проблема називає невизначеність, дослідницьке питання задає перевірювану відповідь. Актуальність пояснює, чому ця відповідь потрібна. Відсутність локального програмного продукту не доводить наукової прогалини: треба показати, якого знання або обґрунтованого рішення бракує.</w:t>
+      </w:r>
+    </w:p>
+    <w:p>
+      <w:pPr>
+        <w:pStyle w:val="p11"/>
+        <w:rPr/>
+      </w:pPr>
+      <w:r>
+        <w:rPr/>
+        <w:t>Об’єкт ширший за предмет. Для F2 його пов’язують із процесами розроблення, якості, експлуатації чи супроводу ПЗ. Мета повинна мати критерій перевірки. Завдання описують кроки та продукти, необхідні для досягнення мети.</w:t>
+      </w:r>
+    </w:p>
+    <w:p>
+      <w:pPr>
+        <w:pStyle w:val="p11"/>
+        <w:rPr/>
+      </w:pPr>
+      <w:r>
+        <w:rPr/>
+        <w:t>Гіпотеза формулює припущення, яке можна не підтвердити даними. Не кожен проєкт потребує статистичної гіпотези; дослідницьке запитання й обґрунтовані критерії можуть бути достатніми. Важливо заздалегідь назвати, яке свідчення підтримує очікування та що його не підтримує.</w:t>
+      </w:r>
+    </w:p>
+    <w:p>
+      <w:pPr>
+        <w:pStyle w:val="p11"/>
+        <w:rPr/>
+      </w:pPr>
+      <w:r>
+        <w:rPr/>
+      </w:r>
+    </w:p>
+    <w:p>
+      <w:pPr>
+        <w:pStyle w:val="H2"/>
+        <w:rPr/>
+      </w:pPr>
+      <w:r>
+        <w:rPr/>
+        <w:t>Початкові матеріали</w:t>
+      </w:r>
+    </w:p>
+    <w:p>
+      <w:pPr>
+        <w:pStyle w:val="p11"/>
+        <w:rPr/>
+      </w:pPr>
+      <w:r>
+        <w:rPr/>
+      </w:r>
+    </w:p>
+    <w:p>
+      <w:pPr>
+        <w:pStyle w:val="p11"/>
+        <w:rPr/>
+      </w:pPr>
+      <w:r>
+        <w:rPr/>
+        <w:t>Попередня тема або одна із запропонованих тем; 3–5 перевірених наукових чи методичних джерел для початкової постановки; інформація про доступні дані та ресурси. Повний огляд формується в роботі 2.</w:t>
+      </w:r>
+    </w:p>
+    <w:p>
+      <w:pPr>
+        <w:pStyle w:val="p11"/>
+        <w:rPr/>
+      </w:pPr>
+      <w:r>
+        <w:rPr/>
+      </w:r>
+    </w:p>
+    <w:p>
+      <w:pPr>
+        <w:pStyle w:val="H2"/>
+        <w:rPr/>
+      </w:pPr>
+      <w:r>
+        <w:rPr/>
+        <w:t>Крок 1 Описати проблемну ситуацію</w:t>
+      </w:r>
+    </w:p>
+    <w:p>
+      <w:pPr>
+        <w:pStyle w:val="p11"/>
+        <w:rPr/>
+      </w:pPr>
+      <w:r>
+        <w:rPr/>
+      </w:r>
+    </w:p>
+    <w:p>
+      <w:pPr>
+        <w:pStyle w:val="p11"/>
+        <w:rPr/>
+      </w:pPr>
+      <w:r>
+        <w:rPr/>
+        <w:t>Опишіть процес, його учасників або об’єкти, типові умови та конкретне обмеження. Наведіть 1–2 наслідки обмеження. Обсяг — 150–250 слів. Для кожного твердження, запозиченого з джерела, додайте посилання. Власне припущення назвіть припущенням.</w:t>
+      </w:r>
+    </w:p>
+    <w:p>
+      <w:pPr>
+        <w:pStyle w:val="p11"/>
+        <w:rPr/>
+      </w:pPr>
+      <w:r>
+        <w:rPr/>
+      </w:r>
+    </w:p>
+    <w:p>
+      <w:pPr>
+        <w:pStyle w:val="H2"/>
+        <w:rPr/>
+      </w:pPr>
+      <w:r>
+        <w:rPr/>
+        <w:t>Крок 2 Виділити проблему і питання</w:t>
+      </w:r>
+    </w:p>
+    <w:p>
+      <w:pPr>
+        <w:pStyle w:val="p11"/>
+        <w:rPr/>
+      </w:pPr>
+      <w:r>
+        <w:rPr/>
+      </w:r>
+    </w:p>
+    <w:p>
+      <w:pPr>
+        <w:pStyle w:val="p11"/>
+        <w:rPr/>
+      </w:pPr>
+      <w:r>
+        <w:rPr/>
+        <w:t>В одному абзаці відділіть практичну потребу від браку знання. Сформулюйте одне головне питання та не більше трьох підпитань. У питаннях назвіть контекст і властивість, що оцінюється. Не використовуйте «найкращий» або «ефективний» без критерію.</w:t>
+      </w:r>
+    </w:p>
+    <w:p>
+      <w:pPr>
+        <w:pStyle w:val="p11"/>
+        <w:rPr/>
+      </w:pPr>
+      <w:r>
+        <w:rPr/>
+      </w:r>
+    </w:p>
+    <w:p>
+      <w:pPr>
+        <w:pStyle w:val="H2"/>
+        <w:rPr/>
+      </w:pPr>
+      <w:r>
+        <w:rPr/>
+        <w:t>Крок 3 Сформувати методологічний апарат</w:t>
+      </w:r>
+    </w:p>
+    <w:p>
+      <w:pPr>
+        <w:pStyle w:val="p11"/>
+        <w:rPr/>
+      </w:pPr>
+      <w:r>
+        <w:rPr/>
+      </w:r>
+    </w:p>
+    <w:p>
+      <w:pPr>
+        <w:pStyle w:val="p11"/>
+        <w:rPr/>
+      </w:pPr>
+      <w:r>
+        <w:rPr/>
+        <w:t>Запишіть тему, мету, об’єкт і предмет. Сформулюйте 4–6 завдань: огляд, розроблення або добір рішення, протокол, експеримент, аналіз. Для кожного завдання назвіть результат: матриця, алгоритм, реалізація, дані або висновок.</w:t>
+      </w:r>
+    </w:p>
+    <w:p>
+      <w:pPr>
+        <w:pStyle w:val="p11"/>
+        <w:rPr/>
+      </w:pPr>
+      <w:r>
+        <w:rPr/>
+      </w:r>
+    </w:p>
+    <w:p>
+      <w:pPr>
+        <w:pStyle w:val="H2"/>
+        <w:rPr/>
+      </w:pPr>
+      <w:r>
+        <w:rPr/>
+        <w:t>Крок 4 Визначити перевірку і межі</w:t>
+      </w:r>
+    </w:p>
+    <w:p>
+      <w:pPr>
+        <w:pStyle w:val="p11"/>
+        <w:rPr/>
+      </w:pPr>
+      <w:r>
+        <w:rPr/>
+      </w:r>
+    </w:p>
+    <w:p>
+      <w:pPr>
+        <w:pStyle w:val="p11"/>
+        <w:rPr/>
+      </w:pPr>
+      <w:r>
+        <w:rPr/>
+        <w:t>Запишіть гіпотезу або критерії відповіді. Назвіть первинну метрику, можливий baseline, доступні дані, ресурсні обмеження та два ризики. Для кожного ризику визначте резервну дію, яка не підмінює дослідницьке питання.</w:t>
+      </w:r>
+    </w:p>
+    <w:p>
+      <w:pPr>
+        <w:pStyle w:val="p11"/>
+        <w:rPr/>
+      </w:pPr>
+      <w:r>
+        <w:rPr/>
+      </w:r>
+    </w:p>
+    <w:p>
+      <w:pPr>
+        <w:pStyle w:val="H2"/>
+        <w:rPr/>
+      </w:pPr>
+      <w:r>
+        <w:rPr/>
+        <w:t>Крок 5 Перевірити узгодженість</w:t>
+      </w:r>
+    </w:p>
+    <w:p>
+      <w:pPr>
+        <w:pStyle w:val="P1"/>
+        <w:rPr/>
+      </w:pPr>
+      <w:r>
+        <w:rPr/>
+      </w:r>
+    </w:p>
+    <w:p>
+      <w:pPr>
+        <w:pStyle w:val="p11"/>
+        <w:rPr/>
+      </w:pPr>
+      <w:r>
+        <w:rPr/>
+        <w:t>Зіставте питання, мету, завдання та метрики. Визначте завдання, яке безпосередньо перевіряє мету. Обміняйтеся паспортами з іншим студентом: він має встановити, що саме оцінюватиметься і які свідчення потрібні. За зауваженнями уточніть постановку.</w:t>
+      </w:r>
+    </w:p>
+    <w:p>
+      <w:pPr>
+        <w:pStyle w:val="p11"/>
+        <w:rPr/>
+      </w:pPr>
+      <w:r>
+        <w:rPr/>
+      </w:r>
+    </w:p>
+    <w:p>
+      <w:pPr>
+        <w:pStyle w:val="H2"/>
+        <w:rPr/>
+      </w:pPr>
+      <w:r>
+        <w:rPr/>
+        <w:t>Приклади формулювань</w:t>
+      </w:r>
+    </w:p>
+    <w:p>
+      <w:pPr>
+        <w:pStyle w:val="P1"/>
+        <w:rPr/>
+      </w:pPr>
+      <w:r>
+        <w:rPr/>
+      </w:r>
+    </w:p>
+    <w:p>
+      <w:pPr>
+        <w:pStyle w:val="p11"/>
+        <w:rPr/>
+      </w:pPr>
+      <w:r>
+        <w:rPr/>
+        <w:t>F2. Питання: як атомарне приймання ставки впливає на частку порушень узгодженості та p95 затримки за конкурентного навантаження? Об’єкт: процес оброблення конкурентних ставок у програмній системі. Предмет: програмний механізм транзакційного оновлення стану. Вимірювані критерії: порушення інваріанта та затримка. Приклад не встановлює наперед отримане покращення.</w:t>
+      </w:r>
+    </w:p>
+    <w:p>
+      <w:pPr>
+        <w:pStyle w:val="p11"/>
+        <w:rPr/>
+      </w:pPr>
+      <w:r>
+        <w:rPr/>
+      </w:r>
+    </w:p>
+    <w:p>
+      <w:pPr>
+        <w:pStyle w:val="H2"/>
+        <w:rPr/>
+      </w:pPr>
+      <w:r>
+        <w:rPr/>
+        <w:t>Склад звіту</w:t>
+      </w:r>
+    </w:p>
+    <w:p>
+      <w:pPr>
+        <w:pStyle w:val="P1"/>
+        <w:rPr/>
+      </w:pPr>
+      <w:r>
+        <w:rPr/>
+      </w:r>
+    </w:p>
+    <w:p>
+      <w:pPr>
+        <w:pStyle w:val="p11"/>
+        <w:rPr/>
+      </w:pPr>
+      <w:r>
+        <w:rPr/>
+        <w:t>Проблемна ситуація, джерела та актуальність.</w:t>
+      </w:r>
+    </w:p>
+    <w:p>
+      <w:pPr>
+        <w:pStyle w:val="p11"/>
+        <w:rPr/>
+      </w:pPr>
+      <w:r>
+        <w:rPr/>
+        <w:t>Питання й методологічний апарат.</w:t>
+      </w:r>
+    </w:p>
+    <w:p>
+      <w:pPr>
+        <w:pStyle w:val="p11"/>
+        <w:rPr/>
+      </w:pPr>
+      <w:r>
+        <w:rPr/>
+        <w:t>Відповідність завдань результатам.</w:t>
+      </w:r>
+    </w:p>
+    <w:p>
+      <w:pPr>
+        <w:pStyle w:val="p11"/>
+        <w:rPr/>
+      </w:pPr>
+      <w:r>
+        <w:rPr/>
+        <w:t>Первинна метрика, baseline, дані, ризики й резервний сценарій.</w:t>
+      </w:r>
+    </w:p>
+    <w:p>
+      <w:pPr>
+        <w:pStyle w:val="p11"/>
+        <w:rPr/>
+      </w:pPr>
+      <w:r>
+        <w:rPr/>
+        <w:t>Короткий запис змін після взаємного обговорення.</w:t>
+      </w:r>
+    </w:p>
+    <w:p>
+      <w:pPr>
+        <w:pStyle w:val="p11"/>
+        <w:rPr/>
+      </w:pPr>
+      <w:r>
+        <w:rPr/>
+      </w:r>
+    </w:p>
+    <w:p>
+      <w:pPr>
+        <w:pStyle w:val="h11"/>
+        <w:rPr/>
+      </w:pPr>
+      <w:r>
+        <w:rPr/>
+        <w:t>Виконання</w:t>
       </w:r>
     </w:p>
     <w:p>
@@ -1271,10 +1766,25 @@
       <w:lang w:val="en-US" w:eastAsia="uk-UA"/>
     </w:rPr>
   </w:style>
+  <w:style w:type="character" w:styleId="user">
+    <w:name w:val="Символ нумерації (user)"/>
+    <w:qFormat/>
+    <w:rPr/>
+  </w:style>
+  <w:style w:type="character" w:styleId="Strong">
+    <w:name w:val="Strong"/>
+    <w:qFormat/>
+    <w:rPr>
+      <w:b/>
+      <w:bCs/>
+    </w:rPr>
+  </w:style>
   <w:style w:type="character" w:styleId="Style12">
-    <w:name w:val="Символ нумерації"/>
-    <w:qFormat/>
-    <w:rPr/>
+    <w:name w:val="Маркери"/>
+    <w:qFormat/>
+    <w:rPr>
+      <w:rFonts w:ascii="OpenSymbol" w:hAnsi="OpenSymbol" w:eastAsia="OpenSymbol" w:cs="OpenSymbol"/>
+    </w:rPr>
   </w:style>
   <w:style w:type="paragraph" w:styleId="Style13">
     <w:name w:val="Заголовок"/>
@@ -1286,7 +1796,7 @@
       <w:spacing w:before="240" w:after="120"/>
     </w:pPr>
     <w:rPr>
-      <w:rFonts w:ascii="Liberation Sans" w:hAnsi="Liberation Sans" w:eastAsia="Microsoft YaHei" w:cs="Lucida Sans"/>
+      <w:rFonts w:ascii="Liberation Sans" w:hAnsi="Liberation Sans" w:eastAsia="Microsoft YaHei" w:cs="Arial Unicode MS"/>
       <w:sz w:val="28"/>
       <w:szCs w:val="28"/>
     </w:rPr>
@@ -1331,10 +1841,10 @@
       <w:suppressLineNumbers/>
     </w:pPr>
     <w:rPr>
-      <w:rFonts w:cs="Lucida Sans"/>
-    </w:rPr>
-  </w:style>
-  <w:style w:type="paragraph" w:styleId="user">
+      <w:rFonts w:cs="Arial Unicode MS"/>
+    </w:rPr>
+  </w:style>
+  <w:style w:type="paragraph" w:styleId="user1">
     <w:name w:val="Заголовок (user)"/>
     <w:basedOn w:val="Normal"/>
     <w:next w:val="BodyText"/>
@@ -1344,12 +1854,12 @@
       <w:spacing w:before="240" w:after="120"/>
     </w:pPr>
     <w:rPr>
-      <w:rFonts w:ascii="Liberation Sans" w:hAnsi="Liberation Sans" w:eastAsia="Microsoft YaHei" w:cs="Arial Unicode MS"/>
+      <w:rFonts w:ascii="Liberation Sans" w:hAnsi="Liberation Sans" w:eastAsia="Microsoft YaHei" w:cs="Lucida Sans"/>
       <w:sz w:val="28"/>
       <w:szCs w:val="28"/>
     </w:rPr>
   </w:style>
-  <w:style w:type="paragraph" w:styleId="user1">
+  <w:style w:type="paragraph" w:styleId="user2">
     <w:name w:val="Покажчик (user)"/>
     <w:basedOn w:val="Normal"/>
     <w:qFormat/>
@@ -1357,12 +1867,12 @@
       <w:suppressLineNumbers/>
     </w:pPr>
     <w:rPr>
-      <w:rFonts w:cs="Arial Unicode MS"/>
+      <w:rFonts w:cs="Lucida Sans"/>
     </w:rPr>
   </w:style>
   <w:style w:type="paragraph" w:styleId="IndexHeading">
     <w:name w:val="index heading"/>
-    <w:basedOn w:val="user"/>
+    <w:basedOn w:val="Style13"/>
     <w:pPr/>
     <w:rPr/>
   </w:style>
@@ -1638,8 +2148,8 @@
     </w:pPr>
     <w:rPr/>
   </w:style>
-  <w:style w:type="paragraph" w:styleId="Style15">
-    <w:name w:val="Верхній і нижній колонтитули"/>
+  <w:style w:type="paragraph" w:styleId="user3">
+    <w:name w:val="Верхній і нижній колонтитули (user)"/>
     <w:basedOn w:val="Normal"/>
     <w:qFormat/>
     <w:pPr>
@@ -1652,16 +2162,23 @@
     </w:pPr>
     <w:rPr/>
   </w:style>
+  <w:style w:type="paragraph" w:styleId="Style15">
+    <w:name w:val="Верхній і нижній колонтитули"/>
+    <w:basedOn w:val="Normal"/>
+    <w:qFormat/>
+    <w:pPr/>
+    <w:rPr/>
+  </w:style>
   <w:style w:type="paragraph" w:styleId="Header">
     <w:name w:val="header"/>
-    <w:basedOn w:val="Style15"/>
+    <w:basedOn w:val="user3"/>
     <w:pPr>
       <w:suppressLineNumbers/>
     </w:pPr>
     <w:rPr/>
   </w:style>
-  <w:style w:type="numbering" w:styleId="user2" w:default="1">
-    <w:name w:val="Без маркерів (user)"/>
+  <w:style w:type="numbering" w:styleId="Style16" w:default="1">
+    <w:name w:val="Без маркерів"/>
     <w:uiPriority w:val="99"/>
     <w:semiHidden/>
     <w:unhideWhenUsed/>

</xml_diff>

<commit_message>
chore: tring to write something MN
</commit_message>
<xml_diff>
--- a/51MN Metologija naukovyh doslidjen/1/MN_KNT-122_Onyshchenko_15_PR1.docx
+++ b/51MN Metologija naukovyh doslidjen/1/MN_KNT-122_Onyshchenko_15_PR1.docx
@@ -917,7 +917,91 @@
       </w:pPr>
       <w:r>
         <w:rPr/>
-        <w:t>Проблемною ситуацією є відсутність чітких вимірів погоди.</w:t>
+        <w:t>Темою є вимірювання даних погоди на метеостанції села Комишуваха.</w:t>
+      </w:r>
+    </w:p>
+    <w:p>
+      <w:pPr>
+        <w:pStyle w:val="P1"/>
+        <w:rPr/>
+      </w:pPr>
+      <w:r>
+        <w:rPr/>
+        <w:t>Проблемною ситуацією є присутність шуму у вимірах.</w:t>
+      </w:r>
+    </w:p>
+    <w:p>
+      <w:pPr>
+        <w:pStyle w:val="P1"/>
+        <w:rPr/>
+      </w:pPr>
+      <w:r>
+        <w:rPr/>
+        <w:t>Актуальність полягає в тому, що жителі села Комишуваха потребують попередження про екстримальні природні умови, а також приблизний прогноз погоди на день для планування свого дня.</w:t>
+      </w:r>
+    </w:p>
+    <w:p>
+      <w:pPr>
+        <w:pStyle w:val="P1"/>
+        <w:rPr/>
+      </w:pPr>
+      <w:r>
+        <w:rPr/>
+        <w:t xml:space="preserve">Питання </w:t>
+      </w:r>
+    </w:p>
+    <w:p>
+      <w:pPr>
+        <w:pStyle w:val="P1"/>
+        <w:rPr/>
+      </w:pPr>
+      <w:r>
+        <w:rPr/>
+        <w:t xml:space="preserve">Метою є підвищення точності вимірів погоди на метеостанції. Критерій перевірки: </w:t>
+      </w:r>
+    </w:p>
+    <w:p>
+      <w:pPr>
+        <w:pStyle w:val="P1"/>
+        <w:rPr/>
+      </w:pPr>
+      <w:r>
+        <w:rPr/>
+        <w:t xml:space="preserve">Об’єктом є </w:t>
+      </w:r>
+      <w:r>
+        <w:rPr>
+          <w:lang w:val="uk-UA"/>
+        </w:rPr>
+        <w:t>процес розробки програмного забезпечення для формування прогнозу погоди від даних з датчиків метеостанції.</w:t>
+      </w:r>
+    </w:p>
+    <w:p>
+      <w:pPr>
+        <w:pStyle w:val="P1"/>
+        <w:rPr>
+          <w:lang w:val="uk-UA"/>
+        </w:rPr>
+      </w:pPr>
+      <w:r>
+        <w:rPr>
+          <w:lang w:val="uk-UA"/>
+        </w:rPr>
+        <w:t>Предметом є методи та програмні засоби формування прогнозу погоди.</w:t>
+      </w:r>
+    </w:p>
+    <w:p>
+      <w:pPr>
+        <w:pStyle w:val="P1"/>
+        <w:rPr>
+          <w:lang w:val="uk-UA"/>
+        </w:rPr>
+      </w:pPr>
+      <w:r>
+        <w:rPr>
+          <w:lang w:val="uk-UA"/>
+        </w:rPr>
+        <w:t>Завданням для роботи є розробка програмного забезпечення вимірювання датчиків з сенсорів метеостанції та формування прогнозу погоди на 24 години вперед.</w:t>
       </w:r>
     </w:p>
     <w:p>

</xml_diff>

<commit_message>
feat: figuring out SP1
</commit_message>
<xml_diff>
--- a/51MN Metologija naukovyh doslidjen/1/MN_KNT-122_Onyshchenko_15_PR1.docx
+++ b/51MN Metologija naukovyh doslidjen/1/MN_KNT-122_Onyshchenko_15_PR1.docx
@@ -947,7 +947,11 @@
       </w:pPr>
       <w:r>
         <w:rPr/>
-        <w:t xml:space="preserve">Питання </w:t>
+        <w:t>Питання</w:t>
+      </w:r>
+      <w:r>
+        <w:rPr/>
+        <w:t xml:space="preserve"> дослідження: чи можливо мінімізувати шум у вимірах погоди.</w:t>
       </w:r>
     </w:p>
     <w:p>
@@ -958,6 +962,10 @@
       <w:r>
         <w:rPr/>
         <w:t xml:space="preserve">Метою є підвищення точності вимірів погоди на метеостанції. Критерій перевірки: </w:t>
+      </w:r>
+      <w:r>
+        <w:rPr/>
+        <w:t>ковзне середнє.</w:t>
       </w:r>
     </w:p>
     <w:p>
@@ -1851,8 +1859,8 @@
       <w:lang w:val="en-US" w:eastAsia="uk-UA"/>
     </w:rPr>
   </w:style>
-  <w:style w:type="character" w:styleId="user">
-    <w:name w:val="Символ нумерації (user)"/>
+  <w:style w:type="character" w:styleId="Style12">
+    <w:name w:val="Символ нумерації"/>
     <w:qFormat/>
     <w:rPr/>
   </w:style>
@@ -1864,8 +1872,8 @@
       <w:bCs/>
     </w:rPr>
   </w:style>
-  <w:style w:type="character" w:styleId="Style12">
-    <w:name w:val="Маркери"/>
+  <w:style w:type="character" w:styleId="user">
+    <w:name w:val="Маркери (user)"/>
     <w:qFormat/>
     <w:rPr>
       <w:rFonts w:ascii="OpenSymbol" w:hAnsi="OpenSymbol" w:eastAsia="OpenSymbol" w:cs="OpenSymbol"/>
@@ -1881,7 +1889,7 @@
       <w:spacing w:before="240" w:after="120"/>
     </w:pPr>
     <w:rPr>
-      <w:rFonts w:ascii="Liberation Sans" w:hAnsi="Liberation Sans" w:eastAsia="Microsoft YaHei" w:cs="Arial Unicode MS"/>
+      <w:rFonts w:ascii="Liberation Sans" w:hAnsi="Liberation Sans" w:eastAsia="Microsoft YaHei" w:cs="Lucida Sans"/>
       <w:sz w:val="28"/>
       <w:szCs w:val="28"/>
     </w:rPr>
@@ -1926,7 +1934,7 @@
       <w:suppressLineNumbers/>
     </w:pPr>
     <w:rPr>
-      <w:rFonts w:cs="Arial Unicode MS"/>
+      <w:rFonts w:cs="Lucida Sans"/>
     </w:rPr>
   </w:style>
   <w:style w:type="paragraph" w:styleId="user1">
@@ -1939,7 +1947,7 @@
       <w:spacing w:before="240" w:after="120"/>
     </w:pPr>
     <w:rPr>
-      <w:rFonts w:ascii="Liberation Sans" w:hAnsi="Liberation Sans" w:eastAsia="Microsoft YaHei" w:cs="Lucida Sans"/>
+      <w:rFonts w:ascii="Liberation Sans" w:hAnsi="Liberation Sans" w:eastAsia="Microsoft YaHei" w:cs="Arial Unicode MS"/>
       <w:sz w:val="28"/>
       <w:szCs w:val="28"/>
     </w:rPr>
@@ -1952,12 +1960,12 @@
       <w:suppressLineNumbers/>
     </w:pPr>
     <w:rPr>
-      <w:rFonts w:cs="Lucida Sans"/>
+      <w:rFonts w:cs="Arial Unicode MS"/>
     </w:rPr>
   </w:style>
   <w:style w:type="paragraph" w:styleId="IndexHeading">
     <w:name w:val="index heading"/>
-    <w:basedOn w:val="Style13"/>
+    <w:basedOn w:val="user1"/>
     <w:pPr/>
     <w:rPr/>
   </w:style>
@@ -2233,8 +2241,8 @@
     </w:pPr>
     <w:rPr/>
   </w:style>
-  <w:style w:type="paragraph" w:styleId="user3">
-    <w:name w:val="Верхній і нижній колонтитули (user)"/>
+  <w:style w:type="paragraph" w:styleId="Style15">
+    <w:name w:val="Верхній і нижній колонтитули"/>
     <w:basedOn w:val="Normal"/>
     <w:qFormat/>
     <w:pPr>
@@ -2247,8 +2255,8 @@
     </w:pPr>
     <w:rPr/>
   </w:style>
-  <w:style w:type="paragraph" w:styleId="Style15">
-    <w:name w:val="Верхній і нижній колонтитули"/>
+  <w:style w:type="paragraph" w:styleId="user3">
+    <w:name w:val="Верхній і нижній колонтитули (user)"/>
     <w:basedOn w:val="Normal"/>
     <w:qFormat/>
     <w:pPr/>
@@ -2256,14 +2264,14 @@
   </w:style>
   <w:style w:type="paragraph" w:styleId="Header">
     <w:name w:val="header"/>
-    <w:basedOn w:val="user3"/>
+    <w:basedOn w:val="Style15"/>
     <w:pPr>
       <w:suppressLineNumbers/>
     </w:pPr>
     <w:rPr/>
   </w:style>
-  <w:style w:type="numbering" w:styleId="Style16" w:default="1">
-    <w:name w:val="Без маркерів"/>
+  <w:style w:type="numbering" w:styleId="user4" w:default="1">
+    <w:name w:val="Без маркерів (user)"/>
     <w:uiPriority w:val="99"/>
     <w:semiHidden/>
     <w:unhideWhenUsed/>

</xml_diff>

<commit_message>
feat: visited SP lecture
</commit_message>
<xml_diff>
--- a/51MN Metologija naukovyh doslidjen/1/MN_KNT-122_Onyshchenko_15_PR1.docx
+++ b/51MN Metologija naukovyh doslidjen/1/MN_KNT-122_Onyshchenko_15_PR1.docx
@@ -899,6 +899,25 @@
       <w:r>
         <w:rPr/>
         <w:t>Проблемна ситуація, джерела та актуальність</w:t>
+      </w:r>
+    </w:p>
+    <w:p>
+      <w:pPr>
+        <w:pStyle w:val="P1"/>
+        <w:rPr/>
+      </w:pPr>
+      <w:r>
+        <w:rPr/>
+      </w:r>
+    </w:p>
+    <w:p>
+      <w:pPr>
+        <w:pStyle w:val="P1"/>
+        <w:rPr/>
+      </w:pPr>
+      <w:r>
+        <w:rPr/>
+        <w:t xml:space="preserve">Проблемною ситуацією є те, що при вимірюванні </w:t>
       </w:r>
     </w:p>
     <w:p>

</xml_diff>